<commit_message>
Expand dashboard portfolio Design Thinking with project-fit frameworks.
Map Double Diamond, CRISP-DM, JTBD, and decision-centric IA to the current dashboard architecture.

Co-authored-by: Cursor <cursoragent@cursor.com>
</commit_message>
<xml_diff>
--- a/dashboard/Dashboard_Portfolio.docx
+++ b/dashboard/Dashboard_Portfolio.docx
@@ -1040,6 +1040,900 @@
     </w:p>
     <w:p>
       <w:pPr>
+        <w:spacing w:after="100"/>
+      </w:pPr>
+      <w:r>
+        <w:rPr>
+          <w:rFonts w:ascii="Arial" w:cs="Arial" w:eastAsia="Arial" w:hAnsi="Arial"/>
+          <w:sz w:val="20"/>
+          <w:szCs w:val="20"/>
+        </w:rPr>
+        <w:t xml:space="preserve">The dashboard workstream combined classic Design Thinking with analytics and BI frameworks that match how this project ships decisions: property-asymmetric pricing, cancel-tier booking, and recommend-only pilots.</w:t>
+      </w:r>
+    </w:p>
+    <w:p>
+      <w:pPr>
+        <w:pStyle w:val="Heading2"/>
+        <w:spacing w:after="80" w:before="200"/>
+      </w:pPr>
+      <w:r>
+        <w:rPr>
+          <w:rFonts w:ascii="Arial" w:cs="Arial" w:eastAsia="Arial" w:hAnsi="Arial"/>
+          <w:b/>
+          <w:bCs/>
+          <w:color w:val="2E5A88"/>
+          <w:sz w:val="22"/>
+          <w:szCs w:val="22"/>
+        </w:rPr>
+        <w:t xml:space="preserve">Framework stack (why each one)</w:t>
+      </w:r>
+    </w:p>
+    <w:tbl>
+      <w:tblPr>
+        <w:tblW w:type="dxa" w:w="9400"/>
+        <w:tblBorders>
+          <w:top w:val="single" w:color="auto" w:sz="4"/>
+          <w:left w:val="single" w:color="auto" w:sz="4"/>
+          <w:bottom w:val="single" w:color="auto" w:sz="4"/>
+          <w:right w:val="single" w:color="auto" w:sz="4"/>
+          <w:insideH w:val="single" w:color="auto" w:sz="4"/>
+          <w:insideV w:val="single" w:color="auto" w:sz="4"/>
+        </w:tblBorders>
+      </w:tblPr>
+      <w:tblGrid>
+        <w:gridCol w:w="2800"/>
+        <w:gridCol w:w="6600"/>
+      </w:tblGrid>
+      <w:tr>
+        <w:tc>
+          <w:tcPr>
+            <w:tcW w:type="dxa" w:w="2800"/>
+            <w:tcBorders>
+              <w:top w:val="single" w:color="CCCCCC" w:sz="4"/>
+              <w:left w:val="single" w:color="CCCCCC" w:sz="4"/>
+              <w:bottom w:val="single" w:color="CCCCCC" w:sz="4"/>
+              <w:right w:val="single" w:color="CCCCCC" w:sz="4"/>
+            </w:tcBorders>
+            <w:shd w:fill="D6E3F0" w:val="clear"/>
+            <w:tcMar>
+              <w:top w:type="dxa" w:w="40"/>
+              <w:left w:type="dxa" w:w="80"/>
+              <w:bottom w:type="dxa" w:w="40"/>
+              <w:right w:type="dxa" w:w="80"/>
+            </w:tcMar>
+          </w:tcPr>
+          <w:p>
+            <w:pPr>
+              <w:jc w:val="left"/>
+            </w:pPr>
+            <w:r>
+              <w:rPr>
+                <w:rFonts w:ascii="Arial" w:cs="Arial" w:eastAsia="Arial" w:hAnsi="Arial"/>
+                <w:b/>
+                <w:bCs/>
+                <w:sz w:val="17"/>
+                <w:szCs w:val="17"/>
+              </w:rPr>
+              <w:t xml:space="preserve">Framework</w:t>
+            </w:r>
+          </w:p>
+        </w:tc>
+        <w:tc>
+          <w:tcPr>
+            <w:tcW w:type="dxa" w:w="6600"/>
+            <w:tcBorders>
+              <w:top w:val="single" w:color="CCCCCC" w:sz="4"/>
+              <w:left w:val="single" w:color="CCCCCC" w:sz="4"/>
+              <w:bottom w:val="single" w:color="CCCCCC" w:sz="4"/>
+              <w:right w:val="single" w:color="CCCCCC" w:sz="4"/>
+            </w:tcBorders>
+            <w:shd w:fill="D6E3F0" w:val="clear"/>
+            <w:tcMar>
+              <w:top w:type="dxa" w:w="40"/>
+              <w:left w:type="dxa" w:w="80"/>
+              <w:bottom w:type="dxa" w:w="40"/>
+              <w:right w:type="dxa" w:w="80"/>
+            </w:tcMar>
+          </w:tcPr>
+          <w:p>
+            <w:pPr>
+              <w:jc w:val="left"/>
+            </w:pPr>
+            <w:r>
+              <w:rPr>
+                <w:rFonts w:ascii="Arial" w:cs="Arial" w:eastAsia="Arial" w:hAnsi="Arial"/>
+                <w:b/>
+                <w:bCs/>
+                <w:sz w:val="17"/>
+                <w:szCs w:val="17"/>
+              </w:rPr>
+              <w:t xml:space="preserve">Role in this project</w:t>
+            </w:r>
+          </w:p>
+        </w:tc>
+      </w:tr>
+      <w:tr>
+        <w:tc>
+          <w:tcPr>
+            <w:tcW w:type="dxa" w:w="2800"/>
+            <w:tcBorders>
+              <w:top w:val="single" w:color="CCCCCC" w:sz="4"/>
+              <w:left w:val="single" w:color="CCCCCC" w:sz="4"/>
+              <w:bottom w:val="single" w:color="CCCCCC" w:sz="4"/>
+              <w:right w:val="single" w:color="CCCCCC" w:sz="4"/>
+            </w:tcBorders>
+            <w:tcMar>
+              <w:top w:type="dxa" w:w="40"/>
+              <w:left w:type="dxa" w:w="80"/>
+              <w:bottom w:type="dxa" w:w="40"/>
+              <w:right w:type="dxa" w:w="80"/>
+            </w:tcMar>
+          </w:tcPr>
+          <w:p>
+            <w:pPr>
+              <w:jc w:val="left"/>
+            </w:pPr>
+            <w:r>
+              <w:rPr>
+                <w:rFonts w:ascii="Arial" w:cs="Arial" w:eastAsia="Arial" w:hAnsi="Arial"/>
+                <w:b w:val="false"/>
+                <w:bCs w:val="false"/>
+                <w:sz w:val="17"/>
+                <w:szCs w:val="17"/>
+              </w:rPr>
+              <w:t xml:space="preserve">Design Thinking</w:t>
+            </w:r>
+          </w:p>
+        </w:tc>
+        <w:tc>
+          <w:tcPr>
+            <w:tcW w:type="dxa" w:w="6600"/>
+            <w:tcBorders>
+              <w:top w:val="single" w:color="CCCCCC" w:sz="4"/>
+              <w:left w:val="single" w:color="CCCCCC" w:sz="4"/>
+              <w:bottom w:val="single" w:color="CCCCCC" w:sz="4"/>
+              <w:right w:val="single" w:color="CCCCCC" w:sz="4"/>
+            </w:tcBorders>
+            <w:tcMar>
+              <w:top w:type="dxa" w:w="40"/>
+              <w:left w:type="dxa" w:w="80"/>
+              <w:bottom w:type="dxa" w:w="40"/>
+              <w:right w:type="dxa" w:w="80"/>
+            </w:tcMar>
+          </w:tcPr>
+          <w:p>
+            <w:pPr>
+              <w:jc w:val="left"/>
+            </w:pPr>
+            <w:r>
+              <w:rPr>
+                <w:rFonts w:ascii="Arial" w:cs="Arial" w:eastAsia="Arial" w:hAnsi="Arial"/>
+                <w:b w:val="false"/>
+                <w:bCs w:val="false"/>
+                <w:sz w:val="17"/>
+                <w:szCs w:val="17"/>
+              </w:rPr>
+              <w:t xml:space="preserve">Outer loop: stakeholder pain → problem framing → dashboard prototypes</w:t>
+            </w:r>
+          </w:p>
+        </w:tc>
+      </w:tr>
+      <w:tr>
+        <w:tc>
+          <w:tcPr>
+            <w:tcW w:type="dxa" w:w="2800"/>
+            <w:tcBorders>
+              <w:top w:val="single" w:color="CCCCCC" w:sz="4"/>
+              <w:left w:val="single" w:color="CCCCCC" w:sz="4"/>
+              <w:bottom w:val="single" w:color="CCCCCC" w:sz="4"/>
+              <w:right w:val="single" w:color="CCCCCC" w:sz="4"/>
+            </w:tcBorders>
+            <w:tcMar>
+              <w:top w:type="dxa" w:w="40"/>
+              <w:left w:type="dxa" w:w="80"/>
+              <w:bottom w:type="dxa" w:w="40"/>
+              <w:right w:type="dxa" w:w="80"/>
+            </w:tcMar>
+          </w:tcPr>
+          <w:p>
+            <w:pPr>
+              <w:jc w:val="left"/>
+            </w:pPr>
+            <w:r>
+              <w:rPr>
+                <w:rFonts w:ascii="Arial" w:cs="Arial" w:eastAsia="Arial" w:hAnsi="Arial"/>
+                <w:b w:val="false"/>
+                <w:bCs w:val="false"/>
+                <w:sz w:val="17"/>
+                <w:szCs w:val="17"/>
+              </w:rPr>
+              <w:t xml:space="preserve">Double Diamond</w:t>
+            </w:r>
+          </w:p>
+        </w:tc>
+        <w:tc>
+          <w:tcPr>
+            <w:tcW w:type="dxa" w:w="6600"/>
+            <w:tcBorders>
+              <w:top w:val="single" w:color="CCCCCC" w:sz="4"/>
+              <w:left w:val="single" w:color="CCCCCC" w:sz="4"/>
+              <w:bottom w:val="single" w:color="CCCCCC" w:sz="4"/>
+              <w:right w:val="single" w:color="CCCCCC" w:sz="4"/>
+            </w:tcBorders>
+            <w:tcMar>
+              <w:top w:type="dxa" w:w="40"/>
+              <w:left w:type="dxa" w:w="80"/>
+              <w:bottom w:type="dxa" w:w="40"/>
+              <w:right w:type="dxa" w:w="80"/>
+            </w:tcMar>
+          </w:tcPr>
+          <w:p>
+            <w:pPr>
+              <w:jc w:val="left"/>
+            </w:pPr>
+            <w:r>
+              <w:rPr>
+                <w:rFonts w:ascii="Arial" w:cs="Arial" w:eastAsia="Arial" w:hAnsi="Arial"/>
+                <w:b w:val="false"/>
+                <w:bCs w:val="false"/>
+                <w:sz w:val="17"/>
+                <w:szCs w:val="17"/>
+              </w:rPr>
+              <w:t xml:space="preserve">Separates problem space (City ≠ Resort) from solution space (playbook + dashboards)</w:t>
+            </w:r>
+          </w:p>
+        </w:tc>
+      </w:tr>
+      <w:tr>
+        <w:tc>
+          <w:tcPr>
+            <w:tcW w:type="dxa" w:w="2800"/>
+            <w:tcBorders>
+              <w:top w:val="single" w:color="CCCCCC" w:sz="4"/>
+              <w:left w:val="single" w:color="CCCCCC" w:sz="4"/>
+              <w:bottom w:val="single" w:color="CCCCCC" w:sz="4"/>
+              <w:right w:val="single" w:color="CCCCCC" w:sz="4"/>
+            </w:tcBorders>
+            <w:tcMar>
+              <w:top w:type="dxa" w:w="40"/>
+              <w:left w:type="dxa" w:w="80"/>
+              <w:bottom w:type="dxa" w:w="40"/>
+              <w:right w:type="dxa" w:w="80"/>
+            </w:tcMar>
+          </w:tcPr>
+          <w:p>
+            <w:pPr>
+              <w:jc w:val="left"/>
+            </w:pPr>
+            <w:r>
+              <w:rPr>
+                <w:rFonts w:ascii="Arial" w:cs="Arial" w:eastAsia="Arial" w:hAnsi="Arial"/>
+                <w:b w:val="false"/>
+                <w:bCs w:val="false"/>
+                <w:sz w:val="17"/>
+                <w:szCs w:val="17"/>
+              </w:rPr>
+              <w:t xml:space="preserve">CRISP-DM</w:t>
+            </w:r>
+          </w:p>
+        </w:tc>
+        <w:tc>
+          <w:tcPr>
+            <w:tcW w:type="dxa" w:w="6600"/>
+            <w:tcBorders>
+              <w:top w:val="single" w:color="CCCCCC" w:sz="4"/>
+              <w:left w:val="single" w:color="CCCCCC" w:sz="4"/>
+              <w:bottom w:val="single" w:color="CCCCCC" w:sz="4"/>
+              <w:right w:val="single" w:color="CCCCCC" w:sz="4"/>
+            </w:tcBorders>
+            <w:tcMar>
+              <w:top w:type="dxa" w:w="40"/>
+              <w:left w:type="dxa" w:w="80"/>
+              <w:bottom w:type="dxa" w:w="40"/>
+              <w:right w:type="dxa" w:w="80"/>
+            </w:tcMar>
+          </w:tcPr>
+          <w:p>
+            <w:pPr>
+              <w:jc w:val="left"/>
+            </w:pPr>
+            <w:r>
+              <w:rPr>
+                <w:rFonts w:ascii="Arial" w:cs="Arial" w:eastAsia="Arial" w:hAnsi="Arial"/>
+                <w:b w:val="false"/>
+                <w:bCs w:val="false"/>
+                <w:sz w:val="17"/>
+                <w:szCs w:val="17"/>
+              </w:rPr>
+              <w:t xml:space="preserve">Structures analytics pipeline feeding the UI (Understanding → Modeling → Evaluation → recommend-only deploy)</w:t>
+            </w:r>
+          </w:p>
+        </w:tc>
+      </w:tr>
+      <w:tr>
+        <w:tc>
+          <w:tcPr>
+            <w:tcW w:type="dxa" w:w="2800"/>
+            <w:tcBorders>
+              <w:top w:val="single" w:color="CCCCCC" w:sz="4"/>
+              <w:left w:val="single" w:color="CCCCCC" w:sz="4"/>
+              <w:bottom w:val="single" w:color="CCCCCC" w:sz="4"/>
+              <w:right w:val="single" w:color="CCCCCC" w:sz="4"/>
+            </w:tcBorders>
+            <w:tcMar>
+              <w:top w:type="dxa" w:w="40"/>
+              <w:left w:type="dxa" w:w="80"/>
+              <w:bottom w:type="dxa" w:w="40"/>
+              <w:right w:type="dxa" w:w="80"/>
+            </w:tcMar>
+          </w:tcPr>
+          <w:p>
+            <w:pPr>
+              <w:jc w:val="left"/>
+            </w:pPr>
+            <w:r>
+              <w:rPr>
+                <w:rFonts w:ascii="Arial" w:cs="Arial" w:eastAsia="Arial" w:hAnsi="Arial"/>
+                <w:b w:val="false"/>
+                <w:bCs w:val="false"/>
+                <w:sz w:val="17"/>
+                <w:szCs w:val="17"/>
+              </w:rPr>
+              <w:t xml:space="preserve">Jobs-to-be-Done</w:t>
+            </w:r>
+          </w:p>
+        </w:tc>
+        <w:tc>
+          <w:tcPr>
+            <w:tcW w:type="dxa" w:w="6600"/>
+            <w:tcBorders>
+              <w:top w:val="single" w:color="CCCCCC" w:sz="4"/>
+              <w:left w:val="single" w:color="CCCCCC" w:sz="4"/>
+              <w:bottom w:val="single" w:color="CCCCCC" w:sz="4"/>
+              <w:right w:val="single" w:color="CCCCCC" w:sz="4"/>
+            </w:tcBorders>
+            <w:tcMar>
+              <w:top w:type="dxa" w:w="40"/>
+              <w:left w:type="dxa" w:w="80"/>
+              <w:bottom w:type="dxa" w:w="40"/>
+              <w:right w:type="dxa" w:w="80"/>
+            </w:tcMar>
+          </w:tcPr>
+          <w:p>
+            <w:pPr>
+              <w:jc w:val="left"/>
+            </w:pPr>
+            <w:r>
+              <w:rPr>
+                <w:rFonts w:ascii="Arial" w:cs="Arial" w:eastAsia="Arial" w:hAnsi="Arial"/>
+                <w:b w:val="false"/>
+                <w:bCs w:val="false"/>
+                <w:sz w:val="17"/>
+                <w:szCs w:val="17"/>
+              </w:rPr>
+              <w:t xml:space="preserve">Defines what GM / RM / FO / Finance hire the dashboard to do</w:t>
+            </w:r>
+          </w:p>
+        </w:tc>
+      </w:tr>
+      <w:tr>
+        <w:tc>
+          <w:tcPr>
+            <w:tcW w:type="dxa" w:w="2800"/>
+            <w:tcBorders>
+              <w:top w:val="single" w:color="CCCCCC" w:sz="4"/>
+              <w:left w:val="single" w:color="CCCCCC" w:sz="4"/>
+              <w:bottom w:val="single" w:color="CCCCCC" w:sz="4"/>
+              <w:right w:val="single" w:color="CCCCCC" w:sz="4"/>
+            </w:tcBorders>
+            <w:tcMar>
+              <w:top w:type="dxa" w:w="40"/>
+              <w:left w:type="dxa" w:w="80"/>
+              <w:bottom w:type="dxa" w:w="40"/>
+              <w:right w:type="dxa" w:w="80"/>
+            </w:tcMar>
+          </w:tcPr>
+          <w:p>
+            <w:pPr>
+              <w:jc w:val="left"/>
+            </w:pPr>
+            <w:r>
+              <w:rPr>
+                <w:rFonts w:ascii="Arial" w:cs="Arial" w:eastAsia="Arial" w:hAnsi="Arial"/>
+                <w:b w:val="false"/>
+                <w:bCs w:val="false"/>
+                <w:sz w:val="17"/>
+                <w:szCs w:val="17"/>
+              </w:rPr>
+              <w:t xml:space="preserve">Decision-centric IA</w:t>
+            </w:r>
+          </w:p>
+        </w:tc>
+        <w:tc>
+          <w:tcPr>
+            <w:tcW w:type="dxa" w:w="6600"/>
+            <w:tcBorders>
+              <w:top w:val="single" w:color="CCCCCC" w:sz="4"/>
+              <w:left w:val="single" w:color="CCCCCC" w:sz="4"/>
+              <w:bottom w:val="single" w:color="CCCCCC" w:sz="4"/>
+              <w:right w:val="single" w:color="CCCCCC" w:sz="4"/>
+            </w:tcBorders>
+            <w:tcMar>
+              <w:top w:type="dxa" w:w="40"/>
+              <w:left w:type="dxa" w:w="80"/>
+              <w:bottom w:type="dxa" w:w="40"/>
+              <w:right w:type="dxa" w:w="80"/>
+            </w:tcMar>
+          </w:tcPr>
+          <w:p>
+            <w:pPr>
+              <w:jc w:val="left"/>
+            </w:pPr>
+            <w:r>
+              <w:rPr>
+                <w:rFonts w:ascii="Arial" w:cs="Arial" w:eastAsia="Arial" w:hAnsi="Arial"/>
+                <w:b w:val="false"/>
+                <w:bCs w:val="false"/>
+                <w:sz w:val="17"/>
+                <w:szCs w:val="17"/>
+              </w:rPr>
+              <w:t xml:space="preserve">Page flow: Overview → Diagnose → Act (Simulator)</w:t>
+            </w:r>
+          </w:p>
+        </w:tc>
+      </w:tr>
+      <w:tr>
+        <w:tc>
+          <w:tcPr>
+            <w:tcW w:type="dxa" w:w="2800"/>
+            <w:tcBorders>
+              <w:top w:val="single" w:color="CCCCCC" w:sz="4"/>
+              <w:left w:val="single" w:color="CCCCCC" w:sz="4"/>
+              <w:bottom w:val="single" w:color="CCCCCC" w:sz="4"/>
+              <w:right w:val="single" w:color="CCCCCC" w:sz="4"/>
+            </w:tcBorders>
+            <w:tcMar>
+              <w:top w:type="dxa" w:w="40"/>
+              <w:left w:type="dxa" w:w="80"/>
+              <w:bottom w:type="dxa" w:w="40"/>
+              <w:right w:type="dxa" w:w="80"/>
+            </w:tcMar>
+          </w:tcPr>
+          <w:p>
+            <w:pPr>
+              <w:jc w:val="left"/>
+            </w:pPr>
+            <w:r>
+              <w:rPr>
+                <w:rFonts w:ascii="Arial" w:cs="Arial" w:eastAsia="Arial" w:hAnsi="Arial"/>
+                <w:b w:val="false"/>
+                <w:bCs w:val="false"/>
+                <w:sz w:val="17"/>
+                <w:szCs w:val="17"/>
+              </w:rPr>
+              <w:t xml:space="preserve">Shneiderman mantra</w:t>
+            </w:r>
+          </w:p>
+        </w:tc>
+        <w:tc>
+          <w:tcPr>
+            <w:tcW w:type="dxa" w:w="6600"/>
+            <w:tcBorders>
+              <w:top w:val="single" w:color="CCCCCC" w:sz="4"/>
+              <w:left w:val="single" w:color="CCCCCC" w:sz="4"/>
+              <w:bottom w:val="single" w:color="CCCCCC" w:sz="4"/>
+              <w:right w:val="single" w:color="CCCCCC" w:sz="4"/>
+            </w:tcBorders>
+            <w:tcMar>
+              <w:top w:type="dxa" w:w="40"/>
+              <w:left w:type="dxa" w:w="80"/>
+              <w:bottom w:type="dxa" w:w="40"/>
+              <w:right w:type="dxa" w:w="80"/>
+            </w:tcMar>
+          </w:tcPr>
+          <w:p>
+            <w:pPr>
+              <w:jc w:val="left"/>
+            </w:pPr>
+            <w:r>
+              <w:rPr>
+                <w:rFonts w:ascii="Arial" w:cs="Arial" w:eastAsia="Arial" w:hAnsi="Arial"/>
+                <w:b w:val="false"/>
+                <w:bCs w:val="false"/>
+                <w:sz w:val="17"/>
+                <w:szCs w:val="17"/>
+              </w:rPr>
+              <w:t xml:space="preserve">Overview first, zoom &amp; filter, then details-on-demand</w:t>
+            </w:r>
+          </w:p>
+        </w:tc>
+      </w:tr>
+    </w:tbl>
+    <w:p>
+      <w:pPr>
+        <w:pStyle w:val="Heading2"/>
+        <w:spacing w:after="80" w:before="200"/>
+      </w:pPr>
+      <w:r>
+        <w:rPr>
+          <w:rFonts w:ascii="Arial" w:cs="Arial" w:eastAsia="Arial" w:hAnsi="Arial"/>
+          <w:b/>
+          <w:bCs/>
+          <w:color w:val="2E5A88"/>
+          <w:sz w:val="22"/>
+          <w:szCs w:val="22"/>
+        </w:rPr>
+        <w:t xml:space="preserve">Jobs-to-be-Done (stakeholder jobs)</w:t>
+      </w:r>
+    </w:p>
+    <w:tbl>
+      <w:tblPr>
+        <w:tblW w:type="dxa" w:w="9400"/>
+        <w:tblBorders>
+          <w:top w:val="single" w:color="auto" w:sz="4"/>
+          <w:left w:val="single" w:color="auto" w:sz="4"/>
+          <w:bottom w:val="single" w:color="auto" w:sz="4"/>
+          <w:right w:val="single" w:color="auto" w:sz="4"/>
+          <w:insideH w:val="single" w:color="auto" w:sz="4"/>
+          <w:insideV w:val="single" w:color="auto" w:sz="4"/>
+        </w:tblBorders>
+      </w:tblPr>
+      <w:tblGrid>
+        <w:gridCol w:w="2800"/>
+        <w:gridCol w:w="6600"/>
+      </w:tblGrid>
+      <w:tr>
+        <w:tc>
+          <w:tcPr>
+            <w:tcW w:type="dxa" w:w="2800"/>
+            <w:tcBorders>
+              <w:top w:val="single" w:color="CCCCCC" w:sz="4"/>
+              <w:left w:val="single" w:color="CCCCCC" w:sz="4"/>
+              <w:bottom w:val="single" w:color="CCCCCC" w:sz="4"/>
+              <w:right w:val="single" w:color="CCCCCC" w:sz="4"/>
+            </w:tcBorders>
+            <w:shd w:fill="D6E3F0" w:val="clear"/>
+            <w:tcMar>
+              <w:top w:type="dxa" w:w="40"/>
+              <w:left w:type="dxa" w:w="80"/>
+              <w:bottom w:type="dxa" w:w="40"/>
+              <w:right w:type="dxa" w:w="80"/>
+            </w:tcMar>
+          </w:tcPr>
+          <w:p>
+            <w:pPr>
+              <w:jc w:val="left"/>
+            </w:pPr>
+            <w:r>
+              <w:rPr>
+                <w:rFonts w:ascii="Arial" w:cs="Arial" w:eastAsia="Arial" w:hAnsi="Arial"/>
+                <w:b/>
+                <w:bCs/>
+                <w:sz w:val="17"/>
+                <w:szCs w:val="17"/>
+              </w:rPr>
+              <w:t xml:space="preserve">Stakeholder</w:t>
+            </w:r>
+          </w:p>
+        </w:tc>
+        <w:tc>
+          <w:tcPr>
+            <w:tcW w:type="dxa" w:w="6600"/>
+            <w:tcBorders>
+              <w:top w:val="single" w:color="CCCCCC" w:sz="4"/>
+              <w:left w:val="single" w:color="CCCCCC" w:sz="4"/>
+              <w:bottom w:val="single" w:color="CCCCCC" w:sz="4"/>
+              <w:right w:val="single" w:color="CCCCCC" w:sz="4"/>
+            </w:tcBorders>
+            <w:shd w:fill="D6E3F0" w:val="clear"/>
+            <w:tcMar>
+              <w:top w:type="dxa" w:w="40"/>
+              <w:left w:type="dxa" w:w="80"/>
+              <w:bottom w:type="dxa" w:w="40"/>
+              <w:right w:type="dxa" w:w="80"/>
+            </w:tcMar>
+          </w:tcPr>
+          <w:p>
+            <w:pPr>
+              <w:jc w:val="left"/>
+            </w:pPr>
+            <w:r>
+              <w:rPr>
+                <w:rFonts w:ascii="Arial" w:cs="Arial" w:eastAsia="Arial" w:hAnsi="Arial"/>
+                <w:b/>
+                <w:bCs/>
+                <w:sz w:val="17"/>
+                <w:szCs w:val="17"/>
+              </w:rPr>
+              <w:t xml:space="preserve">Job the dashboard must help them do</w:t>
+            </w:r>
+          </w:p>
+        </w:tc>
+      </w:tr>
+      <w:tr>
+        <w:tc>
+          <w:tcPr>
+            <w:tcW w:type="dxa" w:w="2800"/>
+            <w:tcBorders>
+              <w:top w:val="single" w:color="CCCCCC" w:sz="4"/>
+              <w:left w:val="single" w:color="CCCCCC" w:sz="4"/>
+              <w:bottom w:val="single" w:color="CCCCCC" w:sz="4"/>
+              <w:right w:val="single" w:color="CCCCCC" w:sz="4"/>
+            </w:tcBorders>
+            <w:tcMar>
+              <w:top w:type="dxa" w:w="40"/>
+              <w:left w:type="dxa" w:w="80"/>
+              <w:bottom w:type="dxa" w:w="40"/>
+              <w:right w:type="dxa" w:w="80"/>
+            </w:tcMar>
+          </w:tcPr>
+          <w:p>
+            <w:pPr>
+              <w:jc w:val="left"/>
+            </w:pPr>
+            <w:r>
+              <w:rPr>
+                <w:rFonts w:ascii="Arial" w:cs="Arial" w:eastAsia="Arial" w:hAnsi="Arial"/>
+                <w:b w:val="false"/>
+                <w:bCs w:val="false"/>
+                <w:sz w:val="17"/>
+                <w:szCs w:val="17"/>
+              </w:rPr>
+              <w:t xml:space="preserve">GM</w:t>
+            </w:r>
+          </w:p>
+        </w:tc>
+        <w:tc>
+          <w:tcPr>
+            <w:tcW w:type="dxa" w:w="6600"/>
+            <w:tcBorders>
+              <w:top w:val="single" w:color="CCCCCC" w:sz="4"/>
+              <w:left w:val="single" w:color="CCCCCC" w:sz="4"/>
+              <w:bottom w:val="single" w:color="CCCCCC" w:sz="4"/>
+              <w:right w:val="single" w:color="CCCCCC" w:sz="4"/>
+            </w:tcBorders>
+            <w:tcMar>
+              <w:top w:type="dxa" w:w="40"/>
+              <w:left w:type="dxa" w:w="80"/>
+              <w:bottom w:type="dxa" w:w="40"/>
+              <w:right w:type="dxa" w:w="80"/>
+            </w:tcMar>
+          </w:tcPr>
+          <w:p>
+            <w:pPr>
+              <w:jc w:val="left"/>
+            </w:pPr>
+            <w:r>
+              <w:rPr>
+                <w:rFonts w:ascii="Arial" w:cs="Arial" w:eastAsia="Arial" w:hAnsi="Arial"/>
+                <w:b w:val="false"/>
+                <w:bCs w:val="false"/>
+                <w:sz w:val="17"/>
+                <w:szCs w:val="17"/>
+              </w:rPr>
+              <w:t xml:space="preserve">See portfolio health and City vs Resort trade-offs in one view</w:t>
+            </w:r>
+          </w:p>
+        </w:tc>
+      </w:tr>
+      <w:tr>
+        <w:tc>
+          <w:tcPr>
+            <w:tcW w:type="dxa" w:w="2800"/>
+            <w:tcBorders>
+              <w:top w:val="single" w:color="CCCCCC" w:sz="4"/>
+              <w:left w:val="single" w:color="CCCCCC" w:sz="4"/>
+              <w:bottom w:val="single" w:color="CCCCCC" w:sz="4"/>
+              <w:right w:val="single" w:color="CCCCCC" w:sz="4"/>
+            </w:tcBorders>
+            <w:tcMar>
+              <w:top w:type="dxa" w:w="40"/>
+              <w:left w:type="dxa" w:w="80"/>
+              <w:bottom w:type="dxa" w:w="40"/>
+              <w:right w:type="dxa" w:w="80"/>
+            </w:tcMar>
+          </w:tcPr>
+          <w:p>
+            <w:pPr>
+              <w:jc w:val="left"/>
+            </w:pPr>
+            <w:r>
+              <w:rPr>
+                <w:rFonts w:ascii="Arial" w:cs="Arial" w:eastAsia="Arial" w:hAnsi="Arial"/>
+                <w:b w:val="false"/>
+                <w:bCs w:val="false"/>
+                <w:sz w:val="17"/>
+                <w:szCs w:val="17"/>
+              </w:rPr>
+              <w:t xml:space="preserve">Revenue Management</w:t>
+            </w:r>
+          </w:p>
+        </w:tc>
+        <w:tc>
+          <w:tcPr>
+            <w:tcW w:type="dxa" w:w="6600"/>
+            <w:tcBorders>
+              <w:top w:val="single" w:color="CCCCCC" w:sz="4"/>
+              <w:left w:val="single" w:color="CCCCCC" w:sz="4"/>
+              <w:bottom w:val="single" w:color="CCCCCC" w:sz="4"/>
+              <w:right w:val="single" w:color="CCCCCC" w:sz="4"/>
+            </w:tcBorders>
+            <w:tcMar>
+              <w:top w:type="dxa" w:w="40"/>
+              <w:left w:type="dxa" w:w="80"/>
+              <w:bottom w:type="dxa" w:w="40"/>
+              <w:right w:type="dxa" w:w="80"/>
+            </w:tcMar>
+          </w:tcPr>
+          <w:p>
+            <w:pPr>
+              <w:jc w:val="left"/>
+            </w:pPr>
+            <w:r>
+              <w:rPr>
+                <w:rFonts w:ascii="Arial" w:cs="Arial" w:eastAsia="Arial" w:hAnsi="Arial"/>
+                <w:b w:val="false"/>
+                <w:bCs w:val="false"/>
+                <w:sz w:val="17"/>
+                <w:szCs w:val="17"/>
+              </w:rPr>
+              <w:t xml:space="preserve">Inspect RevPAR / ADR / seasonality and stress-test BAR moves in band</w:t>
+            </w:r>
+          </w:p>
+        </w:tc>
+      </w:tr>
+      <w:tr>
+        <w:tc>
+          <w:tcPr>
+            <w:tcW w:type="dxa" w:w="2800"/>
+            <w:tcBorders>
+              <w:top w:val="single" w:color="CCCCCC" w:sz="4"/>
+              <w:left w:val="single" w:color="CCCCCC" w:sz="4"/>
+              <w:bottom w:val="single" w:color="CCCCCC" w:sz="4"/>
+              <w:right w:val="single" w:color="CCCCCC" w:sz="4"/>
+            </w:tcBorders>
+            <w:tcMar>
+              <w:top w:type="dxa" w:w="40"/>
+              <w:left w:type="dxa" w:w="80"/>
+              <w:bottom w:type="dxa" w:w="40"/>
+              <w:right w:type="dxa" w:w="80"/>
+            </w:tcMar>
+          </w:tcPr>
+          <w:p>
+            <w:pPr>
+              <w:jc w:val="left"/>
+            </w:pPr>
+            <w:r>
+              <w:rPr>
+                <w:rFonts w:ascii="Arial" w:cs="Arial" w:eastAsia="Arial" w:hAnsi="Arial"/>
+                <w:b w:val="false"/>
+                <w:bCs w:val="false"/>
+                <w:sz w:val="17"/>
+                <w:szCs w:val="17"/>
+              </w:rPr>
+              <w:t xml:space="preserve">Front Office / Ops</w:t>
+            </w:r>
+          </w:p>
+        </w:tc>
+        <w:tc>
+          <w:tcPr>
+            <w:tcW w:type="dxa" w:w="6600"/>
+            <w:tcBorders>
+              <w:top w:val="single" w:color="CCCCCC" w:sz="4"/>
+              <w:left w:val="single" w:color="CCCCCC" w:sz="4"/>
+              <w:bottom w:val="single" w:color="CCCCCC" w:sz="4"/>
+              <w:right w:val="single" w:color="CCCCCC" w:sz="4"/>
+            </w:tcBorders>
+            <w:tcMar>
+              <w:top w:type="dxa" w:w="40"/>
+              <w:left w:type="dxa" w:w="80"/>
+              <w:bottom w:type="dxa" w:w="40"/>
+              <w:right w:type="dxa" w:w="80"/>
+            </w:tcMar>
+          </w:tcPr>
+          <w:p>
+            <w:pPr>
+              <w:jc w:val="left"/>
+            </w:pPr>
+            <w:r>
+              <w:rPr>
+                <w:rFonts w:ascii="Arial" w:cs="Arial" w:eastAsia="Arial" w:hAnsi="Arial"/>
+                <w:b w:val="false"/>
+                <w:bCs w:val="false"/>
+                <w:sz w:val="17"/>
+                <w:szCs w:val="17"/>
+              </w:rPr>
+              <w:t xml:space="preserve">See where cancel risk concentrates before buffer / walk decisions</w:t>
+            </w:r>
+          </w:p>
+        </w:tc>
+      </w:tr>
+      <w:tr>
+        <w:tc>
+          <w:tcPr>
+            <w:tcW w:type="dxa" w:w="2800"/>
+            <w:tcBorders>
+              <w:top w:val="single" w:color="CCCCCC" w:sz="4"/>
+              <w:left w:val="single" w:color="CCCCCC" w:sz="4"/>
+              <w:bottom w:val="single" w:color="CCCCCC" w:sz="4"/>
+              <w:right w:val="single" w:color="CCCCCC" w:sz="4"/>
+            </w:tcBorders>
+            <w:tcMar>
+              <w:top w:type="dxa" w:w="40"/>
+              <w:left w:type="dxa" w:w="80"/>
+              <w:bottom w:type="dxa" w:w="40"/>
+              <w:right w:type="dxa" w:w="80"/>
+            </w:tcMar>
+          </w:tcPr>
+          <w:p>
+            <w:pPr>
+              <w:jc w:val="left"/>
+            </w:pPr>
+            <w:r>
+              <w:rPr>
+                <w:rFonts w:ascii="Arial" w:cs="Arial" w:eastAsia="Arial" w:hAnsi="Arial"/>
+                <w:b w:val="false"/>
+                <w:bCs w:val="false"/>
+                <w:sz w:val="17"/>
+                <w:szCs w:val="17"/>
+              </w:rPr>
+              <w:t xml:space="preserve">Finance</w:t>
+            </w:r>
+          </w:p>
+        </w:tc>
+        <w:tc>
+          <w:tcPr>
+            <w:tcW w:type="dxa" w:w="6600"/>
+            <w:tcBorders>
+              <w:top w:val="single" w:color="CCCCCC" w:sz="4"/>
+              <w:left w:val="single" w:color="CCCCCC" w:sz="4"/>
+              <w:bottom w:val="single" w:color="CCCCCC" w:sz="4"/>
+              <w:right w:val="single" w:color="CCCCCC" w:sz="4"/>
+            </w:tcBorders>
+            <w:tcMar>
+              <w:top w:type="dxa" w:w="40"/>
+              <w:left w:type="dxa" w:w="80"/>
+              <w:bottom w:type="dxa" w:w="40"/>
+              <w:right w:type="dxa" w:w="80"/>
+            </w:tcMar>
+          </w:tcPr>
+          <w:p>
+            <w:pPr>
+              <w:jc w:val="left"/>
+            </w:pPr>
+            <w:r>
+              <w:rPr>
+                <w:rFonts w:ascii="Arial" w:cs="Arial" w:eastAsia="Arial" w:hAnsi="Arial"/>
+                <w:b w:val="false"/>
+                <w:bCs w:val="false"/>
+                <w:sz w:val="17"/>
+                <w:szCs w:val="17"/>
+              </w:rPr>
+              <w:t xml:space="preserve">Trace KPI definitions; treat uplift as proxy, not committed P&amp;L</w:t>
+            </w:r>
+          </w:p>
+        </w:tc>
+      </w:tr>
+    </w:tbl>
+    <w:p>
+      <w:pPr>
+        <w:pStyle w:val="Heading2"/>
+        <w:spacing w:after="80" w:before="200"/>
+      </w:pPr>
+      <w:r>
+        <w:rPr>
+          <w:rFonts w:ascii="Arial" w:cs="Arial" w:eastAsia="Arial" w:hAnsi="Arial"/>
+          <w:b/>
+          <w:bCs/>
+          <w:color w:val="2E5A88"/>
+          <w:sz w:val="22"/>
+          <w:szCs w:val="22"/>
+        </w:rPr>
+        <w:t xml:space="preserve">Double Diamond × Design Thinking</w:t>
+      </w:r>
+    </w:p>
+    <w:p>
+      <w:pPr>
         <w:pStyle w:val="ListParagraph"/>
         <w:numPr>
           <w:ilvl w:val="0"/>
@@ -1053,7 +1947,7 @@
           <w:sz w:val="20"/>
           <w:szCs w:val="20"/>
         </w:rPr>
-        <w:t xml:space="preserve">Empathize — Stakeholders need one story: raise revenue without uncontrolled cancel/walk/OTA conflict.</w:t>
+        <w:t xml:space="preserve">Discover / Empathize — Decision pain: raise RevPAR without uncontrolled cancel, walk, or OTA conflict when City and Resort do not share the same demand curve.</w:t>
       </w:r>
     </w:p>
     <w:p>
@@ -1071,7 +1965,7 @@
           <w:sz w:val="20"/>
           <w:szCs w:val="20"/>
         </w:rPr>
-        <w:t xml:space="preserve">Define — Problem framed as property-asymmetric demand, not a single portfolio elasticity.</w:t>
+        <w:t xml:space="preserve">Define — Lock problem to property-asymmetric demand + cancel-tier inventory; reject one portfolio elasticity and reject live push of ~+21% City RAISE.</w:t>
       </w:r>
     </w:p>
     <w:p>
@@ -1089,25 +1983,7 @@
           <w:sz w:val="20"/>
           <w:szCs w:val="20"/>
         </w:rPr>
-        <w:t xml:space="preserve">Ideate — Separate pages for Overview / RevPAR / Cancellation / Pricing; dual local-web channels + Power BI.</w:t>
-      </w:r>
-    </w:p>
-    <w:p>
-      <w:pPr>
-        <w:pStyle w:val="ListParagraph"/>
-        <w:numPr>
-          <w:ilvl w:val="0"/>
-          <w:numId w:val="5"/>
-        </w:numPr>
-        <w:spacing w:after="60"/>
-      </w:pPr>
-      <w:r>
-        <w:rPr>
-          <w:rFonts w:ascii="Arial" w:cs="Arial" w:eastAsia="Arial" w:hAnsi="Arial"/>
-          <w:sz w:val="20"/>
-          <w:szCs w:val="20"/>
-        </w:rPr>
-        <w:t xml:space="preserve">Prototype — Streamlit multipage app + HTML static dashboard on the same star-schema facts.</w:t>
+        <w:t xml:space="preserve">Develop / Ideate + Prototype — Map CRISP-DM outputs (scores, ε, ensemble bands) to four decision pages and three channels on the same star-schema facts.</w:t>
       </w:r>
     </w:p>
     <w:p>
@@ -1125,9 +2001,1065 @@
           <w:sz w:val="20"/>
           <w:szCs w:val="20"/>
         </w:rPr>
-        <w:t xml:space="preserve">Test / refine — Filters, design tokens, recommend-only framing (no auto-publish of extreme +21% raises).</w:t>
-      </w:r>
-    </w:p>
+        <w:t xml:space="preserve">Deliver / Test — Validate filters, weighted KPIs, and recommend-only policy (what-if inside ±15% band; no auto-publish).</w:t>
+      </w:r>
+    </w:p>
+    <w:p>
+      <w:pPr>
+        <w:pStyle w:val="Heading2"/>
+        <w:spacing w:after="80" w:before="200"/>
+      </w:pPr>
+      <w:r>
+        <w:rPr>
+          <w:rFonts w:ascii="Arial" w:cs="Arial" w:eastAsia="Arial" w:hAnsi="Arial"/>
+          <w:b/>
+          <w:bCs/>
+          <w:color w:val="2E5A88"/>
+          <w:sz w:val="22"/>
+          <w:szCs w:val="22"/>
+        </w:rPr>
+        <w:t xml:space="preserve">CRISP-DM → dashboard handoff</w:t>
+      </w:r>
+    </w:p>
+    <w:tbl>
+      <w:tblPr>
+        <w:tblW w:type="dxa" w:w="9400"/>
+        <w:tblBorders>
+          <w:top w:val="single" w:color="auto" w:sz="4"/>
+          <w:left w:val="single" w:color="auto" w:sz="4"/>
+          <w:bottom w:val="single" w:color="auto" w:sz="4"/>
+          <w:right w:val="single" w:color="auto" w:sz="4"/>
+          <w:insideH w:val="single" w:color="auto" w:sz="4"/>
+          <w:insideV w:val="single" w:color="auto" w:sz="4"/>
+        </w:tblBorders>
+      </w:tblPr>
+      <w:tblGrid>
+        <w:gridCol w:w="2600"/>
+        <w:gridCol w:w="3400"/>
+        <w:gridCol w:w="3400"/>
+      </w:tblGrid>
+      <w:tr>
+        <w:tc>
+          <w:tcPr>
+            <w:tcW w:type="dxa" w:w="2600"/>
+            <w:tcBorders>
+              <w:top w:val="single" w:color="CCCCCC" w:sz="4"/>
+              <w:left w:val="single" w:color="CCCCCC" w:sz="4"/>
+              <w:bottom w:val="single" w:color="CCCCCC" w:sz="4"/>
+              <w:right w:val="single" w:color="CCCCCC" w:sz="4"/>
+            </w:tcBorders>
+            <w:shd w:fill="D6E3F0" w:val="clear"/>
+            <w:tcMar>
+              <w:top w:type="dxa" w:w="40"/>
+              <w:left w:type="dxa" w:w="80"/>
+              <w:bottom w:type="dxa" w:w="40"/>
+              <w:right w:type="dxa" w:w="80"/>
+            </w:tcMar>
+          </w:tcPr>
+          <w:p>
+            <w:pPr>
+              <w:jc w:val="left"/>
+            </w:pPr>
+            <w:r>
+              <w:rPr>
+                <w:rFonts w:ascii="Arial" w:cs="Arial" w:eastAsia="Arial" w:hAnsi="Arial"/>
+                <w:b/>
+                <w:bCs/>
+                <w:sz w:val="17"/>
+                <w:szCs w:val="17"/>
+              </w:rPr>
+              <w:t xml:space="preserve">CRISP-DM phase</w:t>
+            </w:r>
+          </w:p>
+        </w:tc>
+        <w:tc>
+          <w:tcPr>
+            <w:tcW w:type="dxa" w:w="3400"/>
+            <w:tcBorders>
+              <w:top w:val="single" w:color="CCCCCC" w:sz="4"/>
+              <w:left w:val="single" w:color="CCCCCC" w:sz="4"/>
+              <w:bottom w:val="single" w:color="CCCCCC" w:sz="4"/>
+              <w:right w:val="single" w:color="CCCCCC" w:sz="4"/>
+            </w:tcBorders>
+            <w:shd w:fill="D6E3F0" w:val="clear"/>
+            <w:tcMar>
+              <w:top w:type="dxa" w:w="40"/>
+              <w:left w:type="dxa" w:w="80"/>
+              <w:bottom w:type="dxa" w:w="40"/>
+              <w:right w:type="dxa" w:w="80"/>
+            </w:tcMar>
+          </w:tcPr>
+          <w:p>
+            <w:pPr>
+              <w:jc w:val="left"/>
+            </w:pPr>
+            <w:r>
+              <w:rPr>
+                <w:rFonts w:ascii="Arial" w:cs="Arial" w:eastAsia="Arial" w:hAnsi="Arial"/>
+                <w:b/>
+                <w:bCs/>
+                <w:sz w:val="17"/>
+                <w:szCs w:val="17"/>
+              </w:rPr>
+              <w:t xml:space="preserve">Project artifact</w:t>
+            </w:r>
+          </w:p>
+        </w:tc>
+        <w:tc>
+          <w:tcPr>
+            <w:tcW w:type="dxa" w:w="3400"/>
+            <w:tcBorders>
+              <w:top w:val="single" w:color="CCCCCC" w:sz="4"/>
+              <w:left w:val="single" w:color="CCCCCC" w:sz="4"/>
+              <w:bottom w:val="single" w:color="CCCCCC" w:sz="4"/>
+              <w:right w:val="single" w:color="CCCCCC" w:sz="4"/>
+            </w:tcBorders>
+            <w:shd w:fill="D6E3F0" w:val="clear"/>
+            <w:tcMar>
+              <w:top w:type="dxa" w:w="40"/>
+              <w:left w:type="dxa" w:w="80"/>
+              <w:bottom w:type="dxa" w:w="40"/>
+              <w:right w:type="dxa" w:w="80"/>
+            </w:tcMar>
+          </w:tcPr>
+          <w:p>
+            <w:pPr>
+              <w:jc w:val="left"/>
+            </w:pPr>
+            <w:r>
+              <w:rPr>
+                <w:rFonts w:ascii="Arial" w:cs="Arial" w:eastAsia="Arial" w:hAnsi="Arial"/>
+                <w:b/>
+                <w:bCs/>
+                <w:sz w:val="17"/>
+                <w:szCs w:val="17"/>
+              </w:rPr>
+              <w:t xml:space="preserve">Dashboard exposes</w:t>
+            </w:r>
+          </w:p>
+        </w:tc>
+      </w:tr>
+      <w:tr>
+        <w:tc>
+          <w:tcPr>
+            <w:tcW w:type="dxa" w:w="2600"/>
+            <w:tcBorders>
+              <w:top w:val="single" w:color="CCCCCC" w:sz="4"/>
+              <w:left w:val="single" w:color="CCCCCC" w:sz="4"/>
+              <w:bottom w:val="single" w:color="CCCCCC" w:sz="4"/>
+              <w:right w:val="single" w:color="CCCCCC" w:sz="4"/>
+            </w:tcBorders>
+            <w:tcMar>
+              <w:top w:type="dxa" w:w="40"/>
+              <w:left w:type="dxa" w:w="80"/>
+              <w:bottom w:type="dxa" w:w="40"/>
+              <w:right w:type="dxa" w:w="80"/>
+            </w:tcMar>
+          </w:tcPr>
+          <w:p>
+            <w:pPr>
+              <w:jc w:val="left"/>
+            </w:pPr>
+            <w:r>
+              <w:rPr>
+                <w:rFonts w:ascii="Arial" w:cs="Arial" w:eastAsia="Arial" w:hAnsi="Arial"/>
+                <w:b w:val="false"/>
+                <w:bCs w:val="false"/>
+                <w:sz w:val="17"/>
+                <w:szCs w:val="17"/>
+              </w:rPr>
+              <w:t xml:space="preserve">Business Understanding</w:t>
+            </w:r>
+          </w:p>
+        </w:tc>
+        <w:tc>
+          <w:tcPr>
+            <w:tcW w:type="dxa" w:w="3400"/>
+            <w:tcBorders>
+              <w:top w:val="single" w:color="CCCCCC" w:sz="4"/>
+              <w:left w:val="single" w:color="CCCCCC" w:sz="4"/>
+              <w:bottom w:val="single" w:color="CCCCCC" w:sz="4"/>
+              <w:right w:val="single" w:color="CCCCCC" w:sz="4"/>
+            </w:tcBorders>
+            <w:tcMar>
+              <w:top w:type="dxa" w:w="40"/>
+              <w:left w:type="dxa" w:w="80"/>
+              <w:bottom w:type="dxa" w:w="40"/>
+              <w:right w:type="dxa" w:w="80"/>
+            </w:tcMar>
+          </w:tcPr>
+          <w:p>
+            <w:pPr>
+              <w:jc w:val="left"/>
+            </w:pPr>
+            <w:r>
+              <w:rPr>
+                <w:rFonts w:ascii="Arial" w:cs="Arial" w:eastAsia="Arial" w:hAnsi="Arial"/>
+                <w:b w:val="false"/>
+                <w:bCs w:val="false"/>
+                <w:sz w:val="17"/>
+                <w:szCs w:val="17"/>
+              </w:rPr>
+              <w:t xml:space="preserve">Exec RevPAR vs risk question</w:t>
+            </w:r>
+          </w:p>
+        </w:tc>
+        <w:tc>
+          <w:tcPr>
+            <w:tcW w:type="dxa" w:w="3400"/>
+            <w:tcBorders>
+              <w:top w:val="single" w:color="CCCCCC" w:sz="4"/>
+              <w:left w:val="single" w:color="CCCCCC" w:sz="4"/>
+              <w:bottom w:val="single" w:color="CCCCCC" w:sz="4"/>
+              <w:right w:val="single" w:color="CCCCCC" w:sz="4"/>
+            </w:tcBorders>
+            <w:tcMar>
+              <w:top w:type="dxa" w:w="40"/>
+              <w:left w:type="dxa" w:w="80"/>
+              <w:bottom w:type="dxa" w:w="40"/>
+              <w:right w:type="dxa" w:w="80"/>
+            </w:tcMar>
+          </w:tcPr>
+          <w:p>
+            <w:pPr>
+              <w:jc w:val="left"/>
+            </w:pPr>
+            <w:r>
+              <w:rPr>
+                <w:rFonts w:ascii="Arial" w:cs="Arial" w:eastAsia="Arial" w:hAnsi="Arial"/>
+                <w:b w:val="false"/>
+                <w:bCs w:val="false"/>
+                <w:sz w:val="17"/>
+                <w:szCs w:val="17"/>
+              </w:rPr>
+              <w:t xml:space="preserve">Overview narrative KPIs</w:t>
+            </w:r>
+          </w:p>
+        </w:tc>
+      </w:tr>
+      <w:tr>
+        <w:tc>
+          <w:tcPr>
+            <w:tcW w:type="dxa" w:w="2600"/>
+            <w:tcBorders>
+              <w:top w:val="single" w:color="CCCCCC" w:sz="4"/>
+              <w:left w:val="single" w:color="CCCCCC" w:sz="4"/>
+              <w:bottom w:val="single" w:color="CCCCCC" w:sz="4"/>
+              <w:right w:val="single" w:color="CCCCCC" w:sz="4"/>
+            </w:tcBorders>
+            <w:tcMar>
+              <w:top w:type="dxa" w:w="40"/>
+              <w:left w:type="dxa" w:w="80"/>
+              <w:bottom w:type="dxa" w:w="40"/>
+              <w:right w:type="dxa" w:w="80"/>
+            </w:tcMar>
+          </w:tcPr>
+          <w:p>
+            <w:pPr>
+              <w:jc w:val="left"/>
+            </w:pPr>
+            <w:r>
+              <w:rPr>
+                <w:rFonts w:ascii="Arial" w:cs="Arial" w:eastAsia="Arial" w:hAnsi="Arial"/>
+                <w:b w:val="false"/>
+                <w:bCs w:val="false"/>
+                <w:sz w:val="17"/>
+                <w:szCs w:val="17"/>
+              </w:rPr>
+              <w:t xml:space="preserve">Data Prep</w:t>
+            </w:r>
+          </w:p>
+        </w:tc>
+        <w:tc>
+          <w:tcPr>
+            <w:tcW w:type="dxa" w:w="3400"/>
+            <w:tcBorders>
+              <w:top w:val="single" w:color="CCCCCC" w:sz="4"/>
+              <w:left w:val="single" w:color="CCCCCC" w:sz="4"/>
+              <w:bottom w:val="single" w:color="CCCCCC" w:sz="4"/>
+              <w:right w:val="single" w:color="CCCCCC" w:sz="4"/>
+            </w:tcBorders>
+            <w:tcMar>
+              <w:top w:type="dxa" w:w="40"/>
+              <w:left w:type="dxa" w:w="80"/>
+              <w:bottom w:type="dxa" w:w="40"/>
+              <w:right w:type="dxa" w:w="80"/>
+            </w:tcMar>
+          </w:tcPr>
+          <w:p>
+            <w:pPr>
+              <w:jc w:val="left"/>
+            </w:pPr>
+            <w:r>
+              <w:rPr>
+                <w:rFonts w:ascii="Arial" w:cs="Arial" w:eastAsia="Arial" w:hAnsi="Arial"/>
+                <w:b w:val="false"/>
+                <w:bCs w:val="false"/>
+                <w:sz w:val="17"/>
+                <w:szCs w:val="17"/>
+              </w:rPr>
+              <w:t xml:space="preserve">v5 → star-schema CSV</w:t>
+            </w:r>
+          </w:p>
+        </w:tc>
+        <w:tc>
+          <w:tcPr>
+            <w:tcW w:type="dxa" w:w="3400"/>
+            <w:tcBorders>
+              <w:top w:val="single" w:color="CCCCCC" w:sz="4"/>
+              <w:left w:val="single" w:color="CCCCCC" w:sz="4"/>
+              <w:bottom w:val="single" w:color="CCCCCC" w:sz="4"/>
+              <w:right w:val="single" w:color="CCCCCC" w:sz="4"/>
+            </w:tcBorders>
+            <w:tcMar>
+              <w:top w:type="dxa" w:w="40"/>
+              <w:left w:type="dxa" w:w="80"/>
+              <w:bottom w:type="dxa" w:w="40"/>
+              <w:right w:type="dxa" w:w="80"/>
+            </w:tcMar>
+          </w:tcPr>
+          <w:p>
+            <w:pPr>
+              <w:jc w:val="left"/>
+            </w:pPr>
+            <w:r>
+              <w:rPr>
+                <w:rFonts w:ascii="Arial" w:cs="Arial" w:eastAsia="Arial" w:hAnsi="Arial"/>
+                <w:b w:val="false"/>
+                <w:bCs w:val="false"/>
+                <w:sz w:val="17"/>
+                <w:szCs w:val="17"/>
+              </w:rPr>
+              <w:t xml:space="preserve">Stable facts for filters</w:t>
+            </w:r>
+          </w:p>
+        </w:tc>
+      </w:tr>
+      <w:tr>
+        <w:tc>
+          <w:tcPr>
+            <w:tcW w:type="dxa" w:w="2600"/>
+            <w:tcBorders>
+              <w:top w:val="single" w:color="CCCCCC" w:sz="4"/>
+              <w:left w:val="single" w:color="CCCCCC" w:sz="4"/>
+              <w:bottom w:val="single" w:color="CCCCCC" w:sz="4"/>
+              <w:right w:val="single" w:color="CCCCCC" w:sz="4"/>
+            </w:tcBorders>
+            <w:tcMar>
+              <w:top w:type="dxa" w:w="40"/>
+              <w:left w:type="dxa" w:w="80"/>
+              <w:bottom w:type="dxa" w:w="40"/>
+              <w:right w:type="dxa" w:w="80"/>
+            </w:tcMar>
+          </w:tcPr>
+          <w:p>
+            <w:pPr>
+              <w:jc w:val="left"/>
+            </w:pPr>
+            <w:r>
+              <w:rPr>
+                <w:rFonts w:ascii="Arial" w:cs="Arial" w:eastAsia="Arial" w:hAnsi="Arial"/>
+                <w:b w:val="false"/>
+                <w:bCs w:val="false"/>
+                <w:sz w:val="17"/>
+                <w:szCs w:val="17"/>
+              </w:rPr>
+              <w:t xml:space="preserve">Modeling</w:t>
+            </w:r>
+          </w:p>
+        </w:tc>
+        <w:tc>
+          <w:tcPr>
+            <w:tcW w:type="dxa" w:w="3400"/>
+            <w:tcBorders>
+              <w:top w:val="single" w:color="CCCCCC" w:sz="4"/>
+              <w:left w:val="single" w:color="CCCCCC" w:sz="4"/>
+              <w:bottom w:val="single" w:color="CCCCCC" w:sz="4"/>
+              <w:right w:val="single" w:color="CCCCCC" w:sz="4"/>
+            </w:tcBorders>
+            <w:tcMar>
+              <w:top w:type="dxa" w:w="40"/>
+              <w:left w:type="dxa" w:w="80"/>
+              <w:bottom w:type="dxa" w:w="40"/>
+              <w:right w:type="dxa" w:w="80"/>
+            </w:tcMar>
+          </w:tcPr>
+          <w:p>
+            <w:pPr>
+              <w:jc w:val="left"/>
+            </w:pPr>
+            <w:r>
+              <w:rPr>
+                <w:rFonts w:ascii="Arial" w:cs="Arial" w:eastAsia="Arial" w:hAnsi="Arial"/>
+                <w:b w:val="false"/>
+                <w:bCs w:val="false"/>
+                <w:sz w:val="17"/>
+                <w:szCs w:val="17"/>
+              </w:rPr>
+              <w:t xml:space="preserve">LightGBM, ε, BAR ensemble</w:t>
+            </w:r>
+          </w:p>
+        </w:tc>
+        <w:tc>
+          <w:tcPr>
+            <w:tcW w:type="dxa" w:w="3400"/>
+            <w:tcBorders>
+              <w:top w:val="single" w:color="CCCCCC" w:sz="4"/>
+              <w:left w:val="single" w:color="CCCCCC" w:sz="4"/>
+              <w:bottom w:val="single" w:color="CCCCCC" w:sz="4"/>
+              <w:right w:val="single" w:color="CCCCCC" w:sz="4"/>
+            </w:tcBorders>
+            <w:tcMar>
+              <w:top w:type="dxa" w:w="40"/>
+              <w:left w:type="dxa" w:w="80"/>
+              <w:bottom w:type="dxa" w:w="40"/>
+              <w:right w:type="dxa" w:w="80"/>
+            </w:tcMar>
+          </w:tcPr>
+          <w:p>
+            <w:pPr>
+              <w:jc w:val="left"/>
+            </w:pPr>
+            <w:r>
+              <w:rPr>
+                <w:rFonts w:ascii="Arial" w:cs="Arial" w:eastAsia="Arial" w:hAnsi="Arial"/>
+                <w:b w:val="false"/>
+                <w:bCs w:val="false"/>
+                <w:sz w:val="17"/>
+                <w:szCs w:val="17"/>
+              </w:rPr>
+              <w:t xml:space="preserve">Cancellation + Pricing inputs</w:t>
+            </w:r>
+          </w:p>
+        </w:tc>
+      </w:tr>
+      <w:tr>
+        <w:tc>
+          <w:tcPr>
+            <w:tcW w:type="dxa" w:w="2600"/>
+            <w:tcBorders>
+              <w:top w:val="single" w:color="CCCCCC" w:sz="4"/>
+              <w:left w:val="single" w:color="CCCCCC" w:sz="4"/>
+              <w:bottom w:val="single" w:color="CCCCCC" w:sz="4"/>
+              <w:right w:val="single" w:color="CCCCCC" w:sz="4"/>
+            </w:tcBorders>
+            <w:tcMar>
+              <w:top w:type="dxa" w:w="40"/>
+              <w:left w:type="dxa" w:w="80"/>
+              <w:bottom w:type="dxa" w:w="40"/>
+              <w:right w:type="dxa" w:w="80"/>
+            </w:tcMar>
+          </w:tcPr>
+          <w:p>
+            <w:pPr>
+              <w:jc w:val="left"/>
+            </w:pPr>
+            <w:r>
+              <w:rPr>
+                <w:rFonts w:ascii="Arial" w:cs="Arial" w:eastAsia="Arial" w:hAnsi="Arial"/>
+                <w:b w:val="false"/>
+                <w:bCs w:val="false"/>
+                <w:sz w:val="17"/>
+                <w:szCs w:val="17"/>
+              </w:rPr>
+              <w:t xml:space="preserve">Evaluation</w:t>
+            </w:r>
+          </w:p>
+        </w:tc>
+        <w:tc>
+          <w:tcPr>
+            <w:tcW w:type="dxa" w:w="3400"/>
+            <w:tcBorders>
+              <w:top w:val="single" w:color="CCCCCC" w:sz="4"/>
+              <w:left w:val="single" w:color="CCCCCC" w:sz="4"/>
+              <w:bottom w:val="single" w:color="CCCCCC" w:sz="4"/>
+              <w:right w:val="single" w:color="CCCCCC" w:sz="4"/>
+            </w:tcBorders>
+            <w:tcMar>
+              <w:top w:type="dxa" w:w="40"/>
+              <w:left w:type="dxa" w:w="80"/>
+              <w:bottom w:type="dxa" w:w="40"/>
+              <w:right w:type="dxa" w:w="80"/>
+            </w:tcMar>
+          </w:tcPr>
+          <w:p>
+            <w:pPr>
+              <w:jc w:val="left"/>
+            </w:pPr>
+            <w:r>
+              <w:rPr>
+                <w:rFonts w:ascii="Arial" w:cs="Arial" w:eastAsia="Arial" w:hAnsi="Arial"/>
+                <w:b w:val="false"/>
+                <w:bCs w:val="false"/>
+                <w:sz w:val="17"/>
+                <w:szCs w:val="17"/>
+              </w:rPr>
+              <w:t xml:space="preserve">Back-test go/no-go, dual-objective</w:t>
+            </w:r>
+          </w:p>
+        </w:tc>
+        <w:tc>
+          <w:tcPr>
+            <w:tcW w:type="dxa" w:w="3400"/>
+            <w:tcBorders>
+              <w:top w:val="single" w:color="CCCCCC" w:sz="4"/>
+              <w:left w:val="single" w:color="CCCCCC" w:sz="4"/>
+              <w:bottom w:val="single" w:color="CCCCCC" w:sz="4"/>
+              <w:right w:val="single" w:color="CCCCCC" w:sz="4"/>
+            </w:tcBorders>
+            <w:tcMar>
+              <w:top w:type="dxa" w:w="40"/>
+              <w:left w:type="dxa" w:w="80"/>
+              <w:bottom w:type="dxa" w:w="40"/>
+              <w:right w:type="dxa" w:w="80"/>
+            </w:tcMar>
+          </w:tcPr>
+          <w:p>
+            <w:pPr>
+              <w:jc w:val="left"/>
+            </w:pPr>
+            <w:r>
+              <w:rPr>
+                <w:rFonts w:ascii="Arial" w:cs="Arial" w:eastAsia="Arial" w:hAnsi="Arial"/>
+                <w:b w:val="false"/>
+                <w:bCs w:val="false"/>
+                <w:sz w:val="17"/>
+                <w:szCs w:val="17"/>
+              </w:rPr>
+              <w:t xml:space="preserve">Guardrails in what-if</w:t>
+            </w:r>
+          </w:p>
+        </w:tc>
+      </w:tr>
+      <w:tr>
+        <w:tc>
+          <w:tcPr>
+            <w:tcW w:type="dxa" w:w="2600"/>
+            <w:tcBorders>
+              <w:top w:val="single" w:color="CCCCCC" w:sz="4"/>
+              <w:left w:val="single" w:color="CCCCCC" w:sz="4"/>
+              <w:bottom w:val="single" w:color="CCCCCC" w:sz="4"/>
+              <w:right w:val="single" w:color="CCCCCC" w:sz="4"/>
+            </w:tcBorders>
+            <w:tcMar>
+              <w:top w:type="dxa" w:w="40"/>
+              <w:left w:type="dxa" w:w="80"/>
+              <w:bottom w:type="dxa" w:w="40"/>
+              <w:right w:type="dxa" w:w="80"/>
+            </w:tcMar>
+          </w:tcPr>
+          <w:p>
+            <w:pPr>
+              <w:jc w:val="left"/>
+            </w:pPr>
+            <w:r>
+              <w:rPr>
+                <w:rFonts w:ascii="Arial" w:cs="Arial" w:eastAsia="Arial" w:hAnsi="Arial"/>
+                <w:b w:val="false"/>
+                <w:bCs w:val="false"/>
+                <w:sz w:val="17"/>
+                <w:szCs w:val="17"/>
+              </w:rPr>
+              <w:t xml:space="preserve">Deployment</w:t>
+            </w:r>
+          </w:p>
+        </w:tc>
+        <w:tc>
+          <w:tcPr>
+            <w:tcW w:type="dxa" w:w="3400"/>
+            <w:tcBorders>
+              <w:top w:val="single" w:color="CCCCCC" w:sz="4"/>
+              <w:left w:val="single" w:color="CCCCCC" w:sz="4"/>
+              <w:bottom w:val="single" w:color="CCCCCC" w:sz="4"/>
+              <w:right w:val="single" w:color="CCCCCC" w:sz="4"/>
+            </w:tcBorders>
+            <w:tcMar>
+              <w:top w:type="dxa" w:w="40"/>
+              <w:left w:type="dxa" w:w="80"/>
+              <w:bottom w:type="dxa" w:w="40"/>
+              <w:right w:type="dxa" w:w="80"/>
+            </w:tcMar>
+          </w:tcPr>
+          <w:p>
+            <w:pPr>
+              <w:jc w:val="left"/>
+            </w:pPr>
+            <w:r>
+              <w:rPr>
+                <w:rFonts w:ascii="Arial" w:cs="Arial" w:eastAsia="Arial" w:hAnsi="Arial"/>
+                <w:b w:val="false"/>
+                <w:bCs w:val="false"/>
+                <w:sz w:val="17"/>
+                <w:szCs w:val="17"/>
+              </w:rPr>
+              <w:t xml:space="preserve">Playbook + 16-week pilot</w:t>
+            </w:r>
+          </w:p>
+        </w:tc>
+        <w:tc>
+          <w:tcPr>
+            <w:tcW w:type="dxa" w:w="3400"/>
+            <w:tcBorders>
+              <w:top w:val="single" w:color="CCCCCC" w:sz="4"/>
+              <w:left w:val="single" w:color="CCCCCC" w:sz="4"/>
+              <w:bottom w:val="single" w:color="CCCCCC" w:sz="4"/>
+              <w:right w:val="single" w:color="CCCCCC" w:sz="4"/>
+            </w:tcBorders>
+            <w:tcMar>
+              <w:top w:type="dxa" w:w="40"/>
+              <w:left w:type="dxa" w:w="80"/>
+              <w:bottom w:type="dxa" w:w="40"/>
+              <w:right w:type="dxa" w:w="80"/>
+            </w:tcMar>
+          </w:tcPr>
+          <w:p>
+            <w:pPr>
+              <w:jc w:val="left"/>
+            </w:pPr>
+            <w:r>
+              <w:rPr>
+                <w:rFonts w:ascii="Arial" w:cs="Arial" w:eastAsia="Arial" w:hAnsi="Arial"/>
+                <w:b w:val="false"/>
+                <w:bCs w:val="false"/>
+                <w:sz w:val="17"/>
+                <w:szCs w:val="17"/>
+              </w:rPr>
+              <w:t xml:space="preserve">ΔRevPAR, Δcancel, walk, Direct language</w:t>
+            </w:r>
+          </w:p>
+        </w:tc>
+      </w:tr>
+    </w:tbl>
+    <w:p>
+      <w:pPr>
+        <w:pStyle w:val="Heading2"/>
+        <w:spacing w:after="80" w:before="200"/>
+      </w:pPr>
+      <w:r>
+        <w:rPr>
+          <w:rFonts w:ascii="Arial" w:cs="Arial" w:eastAsia="Arial" w:hAnsi="Arial"/>
+          <w:b/>
+          <w:bCs/>
+          <w:color w:val="2E5A88"/>
+          <w:sz w:val="22"/>
+          <w:szCs w:val="22"/>
+        </w:rPr>
+        <w:t xml:space="preserve">Decision-centric information architecture</w:t>
+      </w:r>
+    </w:p>
+    <w:tbl>
+      <w:tblPr>
+        <w:tblW w:type="dxa" w:w="9400"/>
+        <w:tblBorders>
+          <w:top w:val="single" w:color="auto" w:sz="4"/>
+          <w:left w:val="single" w:color="auto" w:sz="4"/>
+          <w:bottom w:val="single" w:color="auto" w:sz="4"/>
+          <w:right w:val="single" w:color="auto" w:sz="4"/>
+          <w:insideH w:val="single" w:color="auto" w:sz="4"/>
+          <w:insideV w:val="single" w:color="auto" w:sz="4"/>
+        </w:tblBorders>
+      </w:tblPr>
+      <w:tblGrid>
+        <w:gridCol w:w="2600"/>
+        <w:gridCol w:w="3000"/>
+        <w:gridCol w:w="3800"/>
+      </w:tblGrid>
+      <w:tr>
+        <w:tc>
+          <w:tcPr>
+            <w:tcW w:type="dxa" w:w="2600"/>
+            <w:tcBorders>
+              <w:top w:val="single" w:color="CCCCCC" w:sz="4"/>
+              <w:left w:val="single" w:color="CCCCCC" w:sz="4"/>
+              <w:bottom w:val="single" w:color="CCCCCC" w:sz="4"/>
+              <w:right w:val="single" w:color="CCCCCC" w:sz="4"/>
+            </w:tcBorders>
+            <w:shd w:fill="D6E3F0" w:val="clear"/>
+            <w:tcMar>
+              <w:top w:type="dxa" w:w="40"/>
+              <w:left w:type="dxa" w:w="80"/>
+              <w:bottom w:type="dxa" w:w="40"/>
+              <w:right w:type="dxa" w:w="80"/>
+            </w:tcMar>
+          </w:tcPr>
+          <w:p>
+            <w:pPr>
+              <w:jc w:val="left"/>
+            </w:pPr>
+            <w:r>
+              <w:rPr>
+                <w:rFonts w:ascii="Arial" w:cs="Arial" w:eastAsia="Arial" w:hAnsi="Arial"/>
+                <w:b/>
+                <w:bCs/>
+                <w:sz w:val="17"/>
+                <w:szCs w:val="17"/>
+              </w:rPr>
+              <w:t xml:space="preserve">Layer</w:t>
+            </w:r>
+          </w:p>
+        </w:tc>
+        <w:tc>
+          <w:tcPr>
+            <w:tcW w:type="dxa" w:w="3000"/>
+            <w:tcBorders>
+              <w:top w:val="single" w:color="CCCCCC" w:sz="4"/>
+              <w:left w:val="single" w:color="CCCCCC" w:sz="4"/>
+              <w:bottom w:val="single" w:color="CCCCCC" w:sz="4"/>
+              <w:right w:val="single" w:color="CCCCCC" w:sz="4"/>
+            </w:tcBorders>
+            <w:shd w:fill="D6E3F0" w:val="clear"/>
+            <w:tcMar>
+              <w:top w:type="dxa" w:w="40"/>
+              <w:left w:type="dxa" w:w="80"/>
+              <w:bottom w:type="dxa" w:w="40"/>
+              <w:right w:type="dxa" w:w="80"/>
+            </w:tcMar>
+          </w:tcPr>
+          <w:p>
+            <w:pPr>
+              <w:jc w:val="left"/>
+            </w:pPr>
+            <w:r>
+              <w:rPr>
+                <w:rFonts w:ascii="Arial" w:cs="Arial" w:eastAsia="Arial" w:hAnsi="Arial"/>
+                <w:b/>
+                <w:bCs/>
+                <w:sz w:val="17"/>
+                <w:szCs w:val="17"/>
+              </w:rPr>
+              <w:t xml:space="preserve">Pages</w:t>
+            </w:r>
+          </w:p>
+        </w:tc>
+        <w:tc>
+          <w:tcPr>
+            <w:tcW w:type="dxa" w:w="3800"/>
+            <w:tcBorders>
+              <w:top w:val="single" w:color="CCCCCC" w:sz="4"/>
+              <w:left w:val="single" w:color="CCCCCC" w:sz="4"/>
+              <w:bottom w:val="single" w:color="CCCCCC" w:sz="4"/>
+              <w:right w:val="single" w:color="CCCCCC" w:sz="4"/>
+            </w:tcBorders>
+            <w:shd w:fill="D6E3F0" w:val="clear"/>
+            <w:tcMar>
+              <w:top w:type="dxa" w:w="40"/>
+              <w:left w:type="dxa" w:w="80"/>
+              <w:bottom w:type="dxa" w:w="40"/>
+              <w:right w:type="dxa" w:w="80"/>
+            </w:tcMar>
+          </w:tcPr>
+          <w:p>
+            <w:pPr>
+              <w:jc w:val="left"/>
+            </w:pPr>
+            <w:r>
+              <w:rPr>
+                <w:rFonts w:ascii="Arial" w:cs="Arial" w:eastAsia="Arial" w:hAnsi="Arial"/>
+                <w:b/>
+                <w:bCs/>
+                <w:sz w:val="17"/>
+                <w:szCs w:val="17"/>
+              </w:rPr>
+              <w:t xml:space="preserve">Intent</w:t>
+            </w:r>
+          </w:p>
+        </w:tc>
+      </w:tr>
+      <w:tr>
+        <w:tc>
+          <w:tcPr>
+            <w:tcW w:type="dxa" w:w="2600"/>
+            <w:tcBorders>
+              <w:top w:val="single" w:color="CCCCCC" w:sz="4"/>
+              <w:left w:val="single" w:color="CCCCCC" w:sz="4"/>
+              <w:bottom w:val="single" w:color="CCCCCC" w:sz="4"/>
+              <w:right w:val="single" w:color="CCCCCC" w:sz="4"/>
+            </w:tcBorders>
+            <w:tcMar>
+              <w:top w:type="dxa" w:w="40"/>
+              <w:left w:type="dxa" w:w="80"/>
+              <w:bottom w:type="dxa" w:w="40"/>
+              <w:right w:type="dxa" w:w="80"/>
+            </w:tcMar>
+          </w:tcPr>
+          <w:p>
+            <w:pPr>
+              <w:jc w:val="left"/>
+            </w:pPr>
+            <w:r>
+              <w:rPr>
+                <w:rFonts w:ascii="Arial" w:cs="Arial" w:eastAsia="Arial" w:hAnsi="Arial"/>
+                <w:b w:val="false"/>
+                <w:bCs w:val="false"/>
+                <w:sz w:val="17"/>
+                <w:szCs w:val="17"/>
+              </w:rPr>
+              <w:t xml:space="preserve">Overview</w:t>
+            </w:r>
+          </w:p>
+        </w:tc>
+        <w:tc>
+          <w:tcPr>
+            <w:tcW w:type="dxa" w:w="3000"/>
+            <w:tcBorders>
+              <w:top w:val="single" w:color="CCCCCC" w:sz="4"/>
+              <w:left w:val="single" w:color="CCCCCC" w:sz="4"/>
+              <w:bottom w:val="single" w:color="CCCCCC" w:sz="4"/>
+              <w:right w:val="single" w:color="CCCCCC" w:sz="4"/>
+            </w:tcBorders>
+            <w:tcMar>
+              <w:top w:type="dxa" w:w="40"/>
+              <w:left w:type="dxa" w:w="80"/>
+              <w:bottom w:type="dxa" w:w="40"/>
+              <w:right w:type="dxa" w:w="80"/>
+            </w:tcMar>
+          </w:tcPr>
+          <w:p>
+            <w:pPr>
+              <w:jc w:val="left"/>
+            </w:pPr>
+            <w:r>
+              <w:rPr>
+                <w:rFonts w:ascii="Arial" w:cs="Arial" w:eastAsia="Arial" w:hAnsi="Arial"/>
+                <w:b w:val="false"/>
+                <w:bCs w:val="false"/>
+                <w:sz w:val="17"/>
+                <w:szCs w:val="17"/>
+              </w:rPr>
+              <w:t xml:space="preserve">Home</w:t>
+            </w:r>
+          </w:p>
+        </w:tc>
+        <w:tc>
+          <w:tcPr>
+            <w:tcW w:type="dxa" w:w="3800"/>
+            <w:tcBorders>
+              <w:top w:val="single" w:color="CCCCCC" w:sz="4"/>
+              <w:left w:val="single" w:color="CCCCCC" w:sz="4"/>
+              <w:bottom w:val="single" w:color="CCCCCC" w:sz="4"/>
+              <w:right w:val="single" w:color="CCCCCC" w:sz="4"/>
+            </w:tcBorders>
+            <w:tcMar>
+              <w:top w:type="dxa" w:w="40"/>
+              <w:left w:type="dxa" w:w="80"/>
+              <w:bottom w:type="dxa" w:w="40"/>
+              <w:right w:type="dxa" w:w="80"/>
+            </w:tcMar>
+          </w:tcPr>
+          <w:p>
+            <w:pPr>
+              <w:jc w:val="left"/>
+            </w:pPr>
+            <w:r>
+              <w:rPr>
+                <w:rFonts w:ascii="Arial" w:cs="Arial" w:eastAsia="Arial" w:hAnsi="Arial"/>
+                <w:b w:val="false"/>
+                <w:bCs w:val="false"/>
+                <w:sz w:val="17"/>
+                <w:szCs w:val="17"/>
+              </w:rPr>
+              <w:t xml:space="preserve">Portfolio pulse — bookings, revenue, ADR, Occ, RevPAR, cancel</w:t>
+            </w:r>
+          </w:p>
+        </w:tc>
+      </w:tr>
+      <w:tr>
+        <w:tc>
+          <w:tcPr>
+            <w:tcW w:type="dxa" w:w="2600"/>
+            <w:tcBorders>
+              <w:top w:val="single" w:color="CCCCCC" w:sz="4"/>
+              <w:left w:val="single" w:color="CCCCCC" w:sz="4"/>
+              <w:bottom w:val="single" w:color="CCCCCC" w:sz="4"/>
+              <w:right w:val="single" w:color="CCCCCC" w:sz="4"/>
+            </w:tcBorders>
+            <w:tcMar>
+              <w:top w:type="dxa" w:w="40"/>
+              <w:left w:type="dxa" w:w="80"/>
+              <w:bottom w:type="dxa" w:w="40"/>
+              <w:right w:type="dxa" w:w="80"/>
+            </w:tcMar>
+          </w:tcPr>
+          <w:p>
+            <w:pPr>
+              <w:jc w:val="left"/>
+            </w:pPr>
+            <w:r>
+              <w:rPr>
+                <w:rFonts w:ascii="Arial" w:cs="Arial" w:eastAsia="Arial" w:hAnsi="Arial"/>
+                <w:b w:val="false"/>
+                <w:bCs w:val="false"/>
+                <w:sz w:val="17"/>
+                <w:szCs w:val="17"/>
+              </w:rPr>
+              <w:t xml:space="preserve">Diagnose</w:t>
+            </w:r>
+          </w:p>
+        </w:tc>
+        <w:tc>
+          <w:tcPr>
+            <w:tcW w:type="dxa" w:w="3000"/>
+            <w:tcBorders>
+              <w:top w:val="single" w:color="CCCCCC" w:sz="4"/>
+              <w:left w:val="single" w:color="CCCCCC" w:sz="4"/>
+              <w:bottom w:val="single" w:color="CCCCCC" w:sz="4"/>
+              <w:right w:val="single" w:color="CCCCCC" w:sz="4"/>
+            </w:tcBorders>
+            <w:tcMar>
+              <w:top w:type="dxa" w:w="40"/>
+              <w:left w:type="dxa" w:w="80"/>
+              <w:bottom w:type="dxa" w:w="40"/>
+              <w:right w:type="dxa" w:w="80"/>
+            </w:tcMar>
+          </w:tcPr>
+          <w:p>
+            <w:pPr>
+              <w:jc w:val="left"/>
+            </w:pPr>
+            <w:r>
+              <w:rPr>
+                <w:rFonts w:ascii="Arial" w:cs="Arial" w:eastAsia="Arial" w:hAnsi="Arial"/>
+                <w:b w:val="false"/>
+                <w:bCs w:val="false"/>
+                <w:sz w:val="17"/>
+                <w:szCs w:val="17"/>
+              </w:rPr>
+              <w:t xml:space="preserve">RevPAR · Cancellation</w:t>
+            </w:r>
+          </w:p>
+        </w:tc>
+        <w:tc>
+          <w:tcPr>
+            <w:tcW w:type="dxa" w:w="3800"/>
+            <w:tcBorders>
+              <w:top w:val="single" w:color="CCCCCC" w:sz="4"/>
+              <w:left w:val="single" w:color="CCCCCC" w:sz="4"/>
+              <w:bottom w:val="single" w:color="CCCCCC" w:sz="4"/>
+              <w:right w:val="single" w:color="CCCCCC" w:sz="4"/>
+            </w:tcBorders>
+            <w:tcMar>
+              <w:top w:type="dxa" w:w="40"/>
+              <w:left w:type="dxa" w:w="80"/>
+              <w:bottom w:type="dxa" w:w="40"/>
+              <w:right w:type="dxa" w:w="80"/>
+            </w:tcMar>
+          </w:tcPr>
+          <w:p>
+            <w:pPr>
+              <w:jc w:val="left"/>
+            </w:pPr>
+            <w:r>
+              <w:rPr>
+                <w:rFonts w:ascii="Arial" w:cs="Arial" w:eastAsia="Arial" w:hAnsi="Arial"/>
+                <w:b w:val="false"/>
+                <w:bCs w:val="false"/>
+                <w:sz w:val="17"/>
+                <w:szCs w:val="17"/>
+              </w:rPr>
+              <w:t xml:space="preserve">Seasonality, mix, cancel drivers</w:t>
+            </w:r>
+          </w:p>
+        </w:tc>
+      </w:tr>
+      <w:tr>
+        <w:tc>
+          <w:tcPr>
+            <w:tcW w:type="dxa" w:w="2600"/>
+            <w:tcBorders>
+              <w:top w:val="single" w:color="CCCCCC" w:sz="4"/>
+              <w:left w:val="single" w:color="CCCCCC" w:sz="4"/>
+              <w:bottom w:val="single" w:color="CCCCCC" w:sz="4"/>
+              <w:right w:val="single" w:color="CCCCCC" w:sz="4"/>
+            </w:tcBorders>
+            <w:tcMar>
+              <w:top w:type="dxa" w:w="40"/>
+              <w:left w:type="dxa" w:w="80"/>
+              <w:bottom w:type="dxa" w:w="40"/>
+              <w:right w:type="dxa" w:w="80"/>
+            </w:tcMar>
+          </w:tcPr>
+          <w:p>
+            <w:pPr>
+              <w:jc w:val="left"/>
+            </w:pPr>
+            <w:r>
+              <w:rPr>
+                <w:rFonts w:ascii="Arial" w:cs="Arial" w:eastAsia="Arial" w:hAnsi="Arial"/>
+                <w:b w:val="false"/>
+                <w:bCs w:val="false"/>
+                <w:sz w:val="17"/>
+                <w:szCs w:val="17"/>
+              </w:rPr>
+              <w:t xml:space="preserve">Act (recommend-only)</w:t>
+            </w:r>
+          </w:p>
+        </w:tc>
+        <w:tc>
+          <w:tcPr>
+            <w:tcW w:type="dxa" w:w="3000"/>
+            <w:tcBorders>
+              <w:top w:val="single" w:color="CCCCCC" w:sz="4"/>
+              <w:left w:val="single" w:color="CCCCCC" w:sz="4"/>
+              <w:bottom w:val="single" w:color="CCCCCC" w:sz="4"/>
+              <w:right w:val="single" w:color="CCCCCC" w:sz="4"/>
+            </w:tcBorders>
+            <w:tcMar>
+              <w:top w:type="dxa" w:w="40"/>
+              <w:left w:type="dxa" w:w="80"/>
+              <w:bottom w:type="dxa" w:w="40"/>
+              <w:right w:type="dxa" w:w="80"/>
+            </w:tcMar>
+          </w:tcPr>
+          <w:p>
+            <w:pPr>
+              <w:jc w:val="left"/>
+            </w:pPr>
+            <w:r>
+              <w:rPr>
+                <w:rFonts w:ascii="Arial" w:cs="Arial" w:eastAsia="Arial" w:hAnsi="Arial"/>
+                <w:b w:val="false"/>
+                <w:bCs w:val="false"/>
+                <w:sz w:val="17"/>
+                <w:szCs w:val="17"/>
+              </w:rPr>
+              <w:t xml:space="preserve">Pricing Simulator</w:t>
+            </w:r>
+          </w:p>
+        </w:tc>
+        <w:tc>
+          <w:tcPr>
+            <w:tcW w:type="dxa" w:w="3800"/>
+            <w:tcBorders>
+              <w:top w:val="single" w:color="CCCCCC" w:sz="4"/>
+              <w:left w:val="single" w:color="CCCCCC" w:sz="4"/>
+              <w:bottom w:val="single" w:color="CCCCCC" w:sz="4"/>
+              <w:right w:val="single" w:color="CCCCCC" w:sz="4"/>
+            </w:tcBorders>
+            <w:tcMar>
+              <w:top w:type="dxa" w:w="40"/>
+              <w:left w:type="dxa" w:w="80"/>
+              <w:bottom w:type="dxa" w:w="40"/>
+              <w:right w:type="dxa" w:w="80"/>
+            </w:tcMar>
+          </w:tcPr>
+          <w:p>
+            <w:pPr>
+              <w:jc w:val="left"/>
+            </w:pPr>
+            <w:r>
+              <w:rPr>
+                <w:rFonts w:ascii="Arial" w:cs="Arial" w:eastAsia="Arial" w:hAnsi="Arial"/>
+                <w:b w:val="false"/>
+                <w:bCs w:val="false"/>
+                <w:sz w:val="17"/>
+                <w:szCs w:val="17"/>
+              </w:rPr>
+              <w:t xml:space="preserve">Controlled ADR what-if — not RMS write-back</w:t>
+            </w:r>
+          </w:p>
+        </w:tc>
+      </w:tr>
+    </w:tbl>
     <w:p>
       <w:pPr>
         <w:spacing w:after="100"/>
@@ -1138,7 +3070,7 @@
           <w:sz w:val="20"/>
           <w:szCs w:val="20"/>
         </w:rPr>
-        <w:t xml:space="preserve">Design principle: show the trade-off (ADR vs volume vs cancel risk), not a single “optimal price” number.</w:t>
+        <w:t xml:space="preserve">North-star design principle: show the trade-off (ADR vs volume vs cancel risk), not a single “optimal price” number—consistent with ensemble floor–recommend–ceil and dual-objective softening of pure-revenue optima.</w:t>
       </w:r>
     </w:p>
     <w:p>

</xml_diff>